<commit_message>
Update MUHAMMAD ZULFAHMI RADITYO - - 3. Worksheet_PABW_Pertemuan3.docx
</commit_message>
<xml_diff>
--- a/Tugas/p3/MUHAMMAD ZULFAHMI RADITYO - - 3. Worksheet_PABW_Pertemuan3.docx
+++ b/Tugas/p3/MUHAMMAD ZULFAHMI RADITYO - - 3. Worksheet_PABW_Pertemuan3.docx
@@ -2779,6 +2779,22 @@
             <w:pPr>
               <w:spacing w:before="20" w:after="20" w:line="252" w:lineRule="auto"/>
             </w:pPr>
+            <w:r>
+              <w:t xml:space="preserve">Daftar </w:t>
+            </w:r>
+            <w:proofErr w:type="spellStart"/>
+            <w:r>
+              <w:t>komik</w:t>
+            </w:r>
+            <w:proofErr w:type="spellEnd"/>
+            <w:r>
+              <w:t xml:space="preserve"> </w:t>
+            </w:r>
+            <w:proofErr w:type="spellStart"/>
+            <w:r>
+              <w:t>saya</w:t>
+            </w:r>
+            <w:proofErr w:type="spellEnd"/>
           </w:p>
         </w:tc>
       </w:tr>
@@ -2826,7 +2842,116 @@
           <w:p>
             <w:pPr>
               <w:spacing w:before="20" w:after="20" w:line="252" w:lineRule="auto"/>
-            </w:pPr>
+              <w:rPr>
+                <w:lang w:val="en-ID"/>
+              </w:rPr>
+            </w:pPr>
+            <w:proofErr w:type="spellStart"/>
+            <w:r>
+              <w:rPr>
+                <w:lang w:val="en-ID"/>
+              </w:rPr>
+              <w:t>Catatan</w:t>
+            </w:r>
+            <w:proofErr w:type="spellEnd"/>
+            <w:r>
+              <w:rPr>
+                <w:lang w:val="en-ID"/>
+              </w:rPr>
+              <w:t xml:space="preserve"> </w:t>
+            </w:r>
+            <w:proofErr w:type="spellStart"/>
+            <w:r>
+              <w:rPr>
+                <w:lang w:val="en-ID"/>
+              </w:rPr>
+              <w:t>koleksi</w:t>
+            </w:r>
+            <w:proofErr w:type="spellEnd"/>
+            <w:r>
+              <w:rPr>
+                <w:lang w:val="en-ID"/>
+              </w:rPr>
+              <w:t xml:space="preserve"> </w:t>
+            </w:r>
+            <w:proofErr w:type="spellStart"/>
+            <w:r>
+              <w:rPr>
+                <w:lang w:val="en-ID"/>
+              </w:rPr>
+              <w:t>komik</w:t>
+            </w:r>
+            <w:proofErr w:type="spellEnd"/>
+            <w:r>
+              <w:rPr>
+                <w:lang w:val="en-ID"/>
+              </w:rPr>
+              <w:t xml:space="preserve"> </w:t>
+            </w:r>
+            <w:proofErr w:type="spellStart"/>
+            <w:r>
+              <w:rPr>
+                <w:lang w:val="en-ID"/>
+              </w:rPr>
+              <w:t>favorit</w:t>
+            </w:r>
+            <w:proofErr w:type="spellEnd"/>
+            <w:r>
+              <w:rPr>
+                <w:lang w:val="en-ID"/>
+              </w:rPr>
+              <w:t xml:space="preserve"> </w:t>
+            </w:r>
+            <w:proofErr w:type="spellStart"/>
+            <w:r>
+              <w:rPr>
+                <w:lang w:val="en-ID"/>
+              </w:rPr>
+              <w:t>beserta</w:t>
+            </w:r>
+            <w:proofErr w:type="spellEnd"/>
+            <w:r>
+              <w:rPr>
+                <w:lang w:val="en-ID"/>
+              </w:rPr>
+              <w:t xml:space="preserve"> volume dan </w:t>
+            </w:r>
+            <w:proofErr w:type="spellStart"/>
+            <w:r>
+              <w:rPr>
+                <w:lang w:val="en-ID"/>
+              </w:rPr>
+              <w:t>formulir</w:t>
+            </w:r>
+            <w:proofErr w:type="spellEnd"/>
+            <w:r>
+              <w:rPr>
+                <w:lang w:val="en-ID"/>
+              </w:rPr>
+              <w:t xml:space="preserve"> </w:t>
+            </w:r>
+            <w:proofErr w:type="spellStart"/>
+            <w:r>
+              <w:rPr>
+                <w:lang w:val="en-ID"/>
+              </w:rPr>
+              <w:t>penambahan</w:t>
+            </w:r>
+            <w:proofErr w:type="spellEnd"/>
+            <w:r>
+              <w:rPr>
+                <w:lang w:val="en-ID"/>
+              </w:rPr>
+              <w:t xml:space="preserve"> </w:t>
+            </w:r>
+            <w:proofErr w:type="spellStart"/>
+            <w:r>
+              <w:rPr>
+                <w:lang w:val="en-ID"/>
+              </w:rPr>
+              <w:t>komik</w:t>
+            </w:r>
+            <w:proofErr w:type="spellEnd"/>
           </w:p>
         </w:tc>
       </w:tr>
@@ -2883,6 +3008,13 @@
                 <w:rFonts w:cs="Carlito"/>
                 <w:sz w:val="19"/>
               </w:rPr>
+              <w:t xml:space="preserve">Daftar </w:t>
+            </w:r>
+            <w:r>
+              <w:rPr>
+                <w:rFonts w:cs="Carlito"/>
+                <w:sz w:val="19"/>
+              </w:rPr>
               <w:t>2.</w:t>
             </w:r>
             <w:r>
@@ -2892,13 +3024,86 @@
               </w:rPr>
               <w:t xml:space="preserve"> </w:t>
             </w:r>
+            <w:proofErr w:type="spellStart"/>
             <w:r>
               <w:rPr>
                 <w:rFonts w:cs="Carlito"/>
                 <w:sz w:val="19"/>
               </w:rPr>
-              <w:t xml:space="preserve"> 3.</w:t>
-            </w:r>
+              <w:t>Tambah</w:t>
+            </w:r>
+            <w:proofErr w:type="spellEnd"/>
+            <w:r>
+              <w:rPr>
+                <w:rFonts w:cs="Carlito"/>
+                <w:sz w:val="19"/>
+              </w:rPr>
+              <w:t xml:space="preserve"> </w:t>
+            </w:r>
+            <w:proofErr w:type="spellStart"/>
+            <w:proofErr w:type="gramStart"/>
+            <w:r>
+              <w:rPr>
+                <w:rFonts w:cs="Carlito"/>
+                <w:sz w:val="19"/>
+              </w:rPr>
+              <w:t>komik</w:t>
+            </w:r>
+            <w:proofErr w:type="spellEnd"/>
+            <w:r>
+              <w:rPr>
+                <w:rFonts w:cs="Carlito"/>
+                <w:sz w:val="19"/>
+              </w:rPr>
+              <w:t xml:space="preserve"> </w:t>
+            </w:r>
+            <w:r>
+              <w:rPr>
+                <w:rFonts w:cs="Carlito"/>
+                <w:sz w:val="19"/>
+              </w:rPr>
+              <w:t xml:space="preserve"> 3</w:t>
+            </w:r>
+            <w:proofErr w:type="gramEnd"/>
+            <w:r>
+              <w:rPr>
+                <w:rFonts w:cs="Carlito"/>
+                <w:sz w:val="19"/>
+              </w:rPr>
+              <w:t>.</w:t>
+            </w:r>
+            <w:r>
+              <w:rPr>
+                <w:rFonts w:cs="Carlito"/>
+                <w:sz w:val="19"/>
+              </w:rPr>
+              <w:t xml:space="preserve"> </w:t>
+            </w:r>
+            <w:proofErr w:type="spellStart"/>
+            <w:r>
+              <w:rPr>
+                <w:rFonts w:cs="Carlito"/>
+                <w:sz w:val="19"/>
+              </w:rPr>
+              <w:t>Tentang</w:t>
+            </w:r>
+            <w:proofErr w:type="spellEnd"/>
+            <w:r>
+              <w:rPr>
+                <w:rFonts w:cs="Carlito"/>
+                <w:sz w:val="19"/>
+              </w:rPr>
+              <w:t xml:space="preserve"> </w:t>
+            </w:r>
+            <w:proofErr w:type="spellStart"/>
+            <w:r>
+              <w:rPr>
+                <w:rFonts w:cs="Carlito"/>
+                <w:sz w:val="19"/>
+              </w:rPr>
+              <w:t>saya</w:t>
+            </w:r>
+            <w:proofErr w:type="spellEnd"/>
           </w:p>
         </w:tc>
       </w:tr>
@@ -2957,8 +3162,63 @@
                 <w:rFonts w:cs="Carlito"/>
                 <w:sz w:val="19"/>
               </w:rPr>
+              <w:t xml:space="preserve">Daftar </w:t>
+            </w:r>
+            <w:proofErr w:type="spellStart"/>
+            <w:r>
+              <w:rPr>
+                <w:rFonts w:cs="Carlito"/>
+                <w:sz w:val="19"/>
+              </w:rPr>
+              <w:t>komik</w:t>
+            </w:r>
+            <w:proofErr w:type="spellEnd"/>
+            <w:r>
+              <w:rPr>
+                <w:rFonts w:cs="Carlito"/>
+                <w:sz w:val="19"/>
+              </w:rPr>
+              <w:t xml:space="preserve"> </w:t>
+            </w:r>
+            <w:r>
+              <w:rPr>
+                <w:rFonts w:cs="Carlito"/>
+                <w:sz w:val="19"/>
+              </w:rPr>
               <w:t>2.</w:t>
             </w:r>
+            <w:r>
+              <w:rPr>
+                <w:rFonts w:cs="Carlito"/>
+                <w:sz w:val="19"/>
+              </w:rPr>
+              <w:t xml:space="preserve"> </w:t>
+            </w:r>
+            <w:proofErr w:type="spellStart"/>
+            <w:r>
+              <w:rPr>
+                <w:rFonts w:cs="Carlito"/>
+                <w:sz w:val="19"/>
+              </w:rPr>
+              <w:t>Tambah</w:t>
+            </w:r>
+            <w:proofErr w:type="spellEnd"/>
+            <w:r>
+              <w:rPr>
+                <w:rFonts w:cs="Carlito"/>
+                <w:sz w:val="19"/>
+              </w:rPr>
+              <w:t xml:space="preserve"> </w:t>
+            </w:r>
+            <w:proofErr w:type="spellStart"/>
+            <w:r>
+              <w:rPr>
+                <w:rFonts w:cs="Carlito"/>
+                <w:sz w:val="19"/>
+              </w:rPr>
+              <w:t>komik</w:t>
+            </w:r>
+            <w:proofErr w:type="spellEnd"/>
           </w:p>
         </w:tc>
       </w:tr>
@@ -3004,7 +3264,36 @@
           <w:p>
             <w:pPr>
               <w:spacing w:before="20" w:after="20" w:line="252" w:lineRule="auto"/>
-            </w:pPr>
+              <w:rPr>
+                <w:lang w:val="en-ID"/>
+              </w:rPr>
+            </w:pPr>
+            <w:proofErr w:type="spellStart"/>
+            <w:r>
+              <w:rPr>
+                <w:lang w:val="en-ID"/>
+              </w:rPr>
+              <w:t>Judul</w:t>
+            </w:r>
+            <w:proofErr w:type="spellEnd"/>
+            <w:r>
+              <w:rPr>
+                <w:lang w:val="en-ID"/>
+              </w:rPr>
+              <w:t xml:space="preserve"> Komik, </w:t>
+            </w:r>
+            <w:r>
+              <w:rPr>
+                <w:lang w:val="en-ID"/>
+              </w:rPr>
+              <w:t>Chapter</w:t>
+            </w:r>
+            <w:r>
+              <w:rPr>
+                <w:lang w:val="en-ID"/>
+              </w:rPr>
+              <w:t>, Status</w:t>
+            </w:r>
           </w:p>
         </w:tc>
       </w:tr>
@@ -3052,7 +3341,52 @@
           <w:p>
             <w:pPr>
               <w:spacing w:before="20" w:after="20" w:line="252" w:lineRule="auto"/>
-            </w:pPr>
+              <w:rPr>
+                <w:lang w:val="en-ID"/>
+              </w:rPr>
+            </w:pPr>
+            <w:proofErr w:type="spellStart"/>
+            <w:r>
+              <w:rPr>
+                <w:lang w:val="en-ID"/>
+              </w:rPr>
+              <w:t>Judul</w:t>
+            </w:r>
+            <w:proofErr w:type="spellEnd"/>
+            <w:r>
+              <w:rPr>
+                <w:lang w:val="en-ID"/>
+              </w:rPr>
+              <w:t xml:space="preserve"> Komik, </w:t>
+            </w:r>
+            <w:proofErr w:type="spellStart"/>
+            <w:r>
+              <w:rPr>
+                <w:lang w:val="en-ID"/>
+              </w:rPr>
+              <w:t>Jumlah</w:t>
+            </w:r>
+            <w:proofErr w:type="spellEnd"/>
+            <w:r>
+              <w:rPr>
+                <w:lang w:val="en-ID"/>
+              </w:rPr>
+              <w:t xml:space="preserve"> Chapter, </w:t>
+            </w:r>
+            <w:proofErr w:type="spellStart"/>
+            <w:r>
+              <w:rPr>
+                <w:lang w:val="en-ID"/>
+              </w:rPr>
+              <w:t>Tanggal</w:t>
+            </w:r>
+            <w:proofErr w:type="spellEnd"/>
+            <w:r>
+              <w:rPr>
+                <w:lang w:val="en-ID"/>
+              </w:rPr>
+              <w:t xml:space="preserve"> Daftar</w:t>
+            </w:r>
           </w:p>
         </w:tc>
       </w:tr>
@@ -3099,13 +3433,24 @@
             <w:pPr>
               <w:spacing w:before="20" w:after="20" w:line="252" w:lineRule="auto"/>
             </w:pPr>
+            <w:proofErr w:type="spellStart"/>
+            <w:proofErr w:type="gramStart"/>
             <w:r>
               <w:rPr>
                 <w:rFonts w:cs="Carlito"/>
                 <w:sz w:val="19"/>
               </w:rPr>
-              <w:t>contoh: koleksi-1.webp</w:t>
-            </w:r>
+              <w:t>komik</w:t>
+            </w:r>
+            <w:r>
+              <w:rPr>
+                <w:rFonts w:cs="Carlito"/>
+                <w:sz w:val="19"/>
+              </w:rPr>
+              <w:t>.webp</w:t>
+            </w:r>
+            <w:proofErr w:type="spellEnd"/>
+            <w:proofErr w:type="gramEnd"/>
           </w:p>
         </w:tc>
       </w:tr>
@@ -3372,7 +3717,6 @@
                 <w:color w:val="8A5A00"/>
                 <w:sz w:val="20"/>
               </w:rPr>
-              <w:lastRenderedPageBreak/>
               <w:t xml:space="preserve">Repositori harus sudah ada di GitHub.  </w:t>
             </w:r>
             <w:r>
@@ -3885,6 +4229,11 @@
             <w:pPr>
               <w:spacing w:before="20" w:after="20" w:line="252" w:lineRule="auto"/>
             </w:pPr>
+            <w:proofErr w:type="spellStart"/>
+            <w:r>
+              <w:t>sudah</w:t>
+            </w:r>
+            <w:proofErr w:type="spellEnd"/>
           </w:p>
         </w:tc>
       </w:tr>
@@ -3933,6 +4282,11 @@
             <w:pPr>
               <w:spacing w:before="20" w:after="20" w:line="252" w:lineRule="auto"/>
             </w:pPr>
+            <w:proofErr w:type="spellStart"/>
+            <w:r>
+              <w:t>sudah</w:t>
+            </w:r>
+            <w:proofErr w:type="spellEnd"/>
           </w:p>
         </w:tc>
       </w:tr>
@@ -3979,6 +4333,11 @@
             <w:pPr>
               <w:spacing w:before="20" w:after="20" w:line="252" w:lineRule="auto"/>
             </w:pPr>
+            <w:proofErr w:type="spellStart"/>
+            <w:r>
+              <w:t>sudah</w:t>
+            </w:r>
+            <w:proofErr w:type="spellEnd"/>
           </w:p>
         </w:tc>
       </w:tr>
@@ -4164,12 +4523,12 @@
           <w:i/>
           <w:sz w:val="19"/>
         </w:rPr>
+        <w:lastRenderedPageBreak/>
         <w:t>Cara memastikan: buka halaman repositori Anda di github.com. README harus tampil memuat bagian “Pertemuan 3” berisi rencana yang baru saja Anda tulis. Bila bagian itu belum ada, berkas README belum tersimpan atau belum di-push. Perhatikan bahwa yang disimpan di sini bukan kode, melainkan rencana — dan itu tetap pekerjaan yang layak disimpan.</w:t>
       </w:r>
     </w:p>
     <w:p>
       <w:r>
-        <w:lastRenderedPageBreak/>
         <w:br w:type="page"/>
       </w:r>
     </w:p>
@@ -5001,6 +5360,11 @@
             <w:pPr>
               <w:spacing w:before="20" w:after="20" w:line="252" w:lineRule="auto"/>
             </w:pPr>
+            <w:proofErr w:type="spellStart"/>
+            <w:r>
+              <w:t>sudah</w:t>
+            </w:r>
+            <w:proofErr w:type="spellEnd"/>
           </w:p>
         </w:tc>
       </w:tr>
@@ -5049,6 +5413,11 @@
             <w:pPr>
               <w:spacing w:before="20" w:after="20" w:line="252" w:lineRule="auto"/>
             </w:pPr>
+            <w:proofErr w:type="spellStart"/>
+            <w:r>
+              <w:t>sudah</w:t>
+            </w:r>
+            <w:proofErr w:type="spellEnd"/>
           </w:p>
         </w:tc>
       </w:tr>
@@ -5975,6 +6344,9 @@
             <w:pPr>
               <w:spacing w:before="20" w:after="20" w:line="252" w:lineRule="auto"/>
             </w:pPr>
+            <w:r>
+              <w:t>Aman</w:t>
+            </w:r>
           </w:p>
         </w:tc>
       </w:tr>
@@ -6047,6 +6419,9 @@
             <w:pPr>
               <w:spacing w:before="20" w:after="20" w:line="252" w:lineRule="auto"/>
             </w:pPr>
+            <w:r>
+              <w:t>Aman</w:t>
+            </w:r>
           </w:p>
         </w:tc>
       </w:tr>
@@ -6116,6 +6491,9 @@
             <w:pPr>
               <w:spacing w:before="20" w:after="20" w:line="252" w:lineRule="auto"/>
             </w:pPr>
+            <w:r>
+              <w:t>Aman</w:t>
+            </w:r>
           </w:p>
         </w:tc>
       </w:tr>
@@ -7612,7 +7990,7 @@
                 <w:rFonts w:cs="Carlito"/>
                 <w:sz w:val="19"/>
               </w:rPr>
-              <w:t>sudah / belum</w:t>
+              <w:t xml:space="preserve">sudah </w:t>
             </w:r>
           </w:p>
         </w:tc>
@@ -7683,7 +8061,7 @@
                 <w:rFonts w:cs="Carlito"/>
                 <w:sz w:val="19"/>
               </w:rPr>
-              <w:t>sudah / belum</w:t>
+              <w:t xml:space="preserve">sudah </w:t>
             </w:r>
           </w:p>
         </w:tc>
@@ -7754,7 +8132,7 @@
                 <w:rFonts w:cs="Carlito"/>
                 <w:sz w:val="19"/>
               </w:rPr>
-              <w:t>sudah / belum</w:t>
+              <w:t xml:space="preserve">sudah </w:t>
             </w:r>
           </w:p>
         </w:tc>
@@ -7825,7 +8203,7 @@
                 <w:rFonts w:cs="Carlito"/>
                 <w:sz w:val="19"/>
               </w:rPr>
-              <w:t>sudah / belum</w:t>
+              <w:t xml:space="preserve">sudah </w:t>
             </w:r>
           </w:p>
         </w:tc>
@@ -7895,7 +8273,7 @@
                 <w:rFonts w:cs="Carlito"/>
                 <w:sz w:val="19"/>
               </w:rPr>
-              <w:t>sudah / belum</w:t>
+              <w:t xml:space="preserve">sudah </w:t>
             </w:r>
           </w:p>
         </w:tc>
@@ -7961,13 +8339,15 @@
             <w:pPr>
               <w:spacing w:before="20" w:after="20" w:line="252" w:lineRule="auto"/>
             </w:pPr>
+            <w:proofErr w:type="spellStart"/>
             <w:r>
               <w:rPr>
                 <w:rFonts w:cs="Carlito"/>
                 <w:sz w:val="19"/>
               </w:rPr>
-              <w:t>sudah / belum</w:t>
-            </w:r>
+              <w:t>sudah</w:t>
+            </w:r>
+            <w:proofErr w:type="spellEnd"/>
           </w:p>
         </w:tc>
         <w:tc>
@@ -8031,13 +8411,15 @@
             <w:pPr>
               <w:spacing w:before="20" w:after="20" w:line="252" w:lineRule="auto"/>
             </w:pPr>
+            <w:proofErr w:type="spellStart"/>
             <w:r>
               <w:rPr>
                 <w:rFonts w:cs="Carlito"/>
                 <w:sz w:val="19"/>
               </w:rPr>
-              <w:t>sudah / belum</w:t>
-            </w:r>
+              <w:t>sudah</w:t>
+            </w:r>
+            <w:proofErr w:type="spellEnd"/>
           </w:p>
         </w:tc>
         <w:tc>
@@ -9765,7 +10147,128 @@
           <w:p>
             <w:pPr>
               <w:spacing w:before="20" w:after="20" w:line="252" w:lineRule="auto"/>
-            </w:pPr>
+              <w:rPr>
+                <w:lang w:val="en-ID"/>
+              </w:rPr>
+            </w:pPr>
+            <w:r>
+              <w:rPr>
+                <w:lang w:val="en-ID"/>
+              </w:rPr>
+              <w:t>"</w:t>
+            </w:r>
+            <w:proofErr w:type="spellStart"/>
+            <w:r>
+              <w:rPr>
+                <w:lang w:val="en-ID"/>
+              </w:rPr>
+              <w:t>Tumpukan</w:t>
+            </w:r>
+            <w:proofErr w:type="spellEnd"/>
+            <w:r>
+              <w:rPr>
+                <w:lang w:val="en-ID"/>
+              </w:rPr>
+              <w:t xml:space="preserve"> </w:t>
+            </w:r>
+            <w:proofErr w:type="spellStart"/>
+            <w:r>
+              <w:rPr>
+                <w:lang w:val="en-ID"/>
+              </w:rPr>
+              <w:t>komik</w:t>
+            </w:r>
+            <w:proofErr w:type="spellEnd"/>
+            <w:r>
+              <w:rPr>
+                <w:lang w:val="en-ID"/>
+              </w:rPr>
+              <w:t xml:space="preserve"> manga </w:t>
+            </w:r>
+            <w:proofErr w:type="gramStart"/>
+            <w:r>
+              <w:rPr>
+                <w:lang w:val="en-ID"/>
+              </w:rPr>
+              <w:t>One Piece</w:t>
+            </w:r>
+            <w:proofErr w:type="gramEnd"/>
+            <w:r>
+              <w:rPr>
+                <w:lang w:val="en-ID"/>
+              </w:rPr>
+              <w:t xml:space="preserve"> </w:t>
+            </w:r>
+            <w:proofErr w:type="spellStart"/>
+            <w:r>
+              <w:rPr>
+                <w:lang w:val="en-ID"/>
+              </w:rPr>
+              <w:t>bersampul</w:t>
+            </w:r>
+            <w:proofErr w:type="spellEnd"/>
+            <w:r>
+              <w:rPr>
+                <w:lang w:val="en-ID"/>
+              </w:rPr>
+              <w:t xml:space="preserve"> </w:t>
+            </w:r>
+            <w:proofErr w:type="spellStart"/>
+            <w:r>
+              <w:rPr>
+                <w:lang w:val="en-ID"/>
+              </w:rPr>
+              <w:t>warna-warni</w:t>
+            </w:r>
+            <w:proofErr w:type="spellEnd"/>
+            <w:r>
+              <w:rPr>
+                <w:lang w:val="en-ID"/>
+              </w:rPr>
+              <w:t xml:space="preserve"> </w:t>
+            </w:r>
+            <w:proofErr w:type="spellStart"/>
+            <w:r>
+              <w:rPr>
+                <w:lang w:val="en-ID"/>
+              </w:rPr>
+              <w:t>tersusun</w:t>
+            </w:r>
+            <w:proofErr w:type="spellEnd"/>
+            <w:r>
+              <w:rPr>
+                <w:lang w:val="en-ID"/>
+              </w:rPr>
+              <w:t xml:space="preserve"> di </w:t>
+            </w:r>
+            <w:proofErr w:type="spellStart"/>
+            <w:r>
+              <w:rPr>
+                <w:lang w:val="en-ID"/>
+              </w:rPr>
+              <w:t>atas</w:t>
+            </w:r>
+            <w:proofErr w:type="spellEnd"/>
+            <w:r>
+              <w:rPr>
+                <w:lang w:val="en-ID"/>
+              </w:rPr>
+              <w:t xml:space="preserve"> </w:t>
+            </w:r>
+            <w:proofErr w:type="spellStart"/>
+            <w:r>
+              <w:rPr>
+                <w:lang w:val="en-ID"/>
+              </w:rPr>
+              <w:t>rak</w:t>
+            </w:r>
+            <w:proofErr w:type="spellEnd"/>
+            <w:r>
+              <w:rPr>
+                <w:lang w:val="en-ID"/>
+              </w:rPr>
+              <w:t xml:space="preserve">" </w:t>
+            </w:r>
           </w:p>
         </w:tc>
         <w:tc>
@@ -9782,6 +10285,9 @@
             <w:pPr>
               <w:spacing w:before="20" w:after="20" w:line="252" w:lineRule="auto"/>
             </w:pPr>
+            <w:r>
+              <w:t>Ya</w:t>
+            </w:r>
           </w:p>
         </w:tc>
       </w:tr>
@@ -9829,7 +10335,114 @@
           <w:p>
             <w:pPr>
               <w:spacing w:before="20" w:after="20" w:line="252" w:lineRule="auto"/>
-            </w:pPr>
+              <w:rPr>
+                <w:lang w:val="en-ID"/>
+              </w:rPr>
+            </w:pPr>
+            <w:r>
+              <w:rPr>
+                <w:lang w:val="en-ID"/>
+              </w:rPr>
+              <w:t>"</w:t>
+            </w:r>
+            <w:proofErr w:type="spellStart"/>
+            <w:r>
+              <w:rPr>
+                <w:lang w:val="en-ID"/>
+              </w:rPr>
+              <w:t>Komik</w:t>
+            </w:r>
+            <w:proofErr w:type="spellEnd"/>
+            <w:r>
+              <w:rPr>
+                <w:lang w:val="en-ID"/>
+              </w:rPr>
+              <w:t xml:space="preserve"> The </w:t>
+            </w:r>
+            <w:proofErr w:type="spellStart"/>
+            <w:r>
+              <w:rPr>
+                <w:lang w:val="en-ID"/>
+              </w:rPr>
+              <w:t>Umbeatable</w:t>
+            </w:r>
+            <w:proofErr w:type="spellEnd"/>
+            <w:r>
+              <w:rPr>
+                <w:lang w:val="en-ID"/>
+              </w:rPr>
+              <w:t xml:space="preserve"> Dungeon's Lazy Boss volume </w:t>
+            </w:r>
+            <w:proofErr w:type="spellStart"/>
+            <w:r>
+              <w:rPr>
+                <w:lang w:val="en-ID"/>
+              </w:rPr>
+              <w:t>lengkap</w:t>
+            </w:r>
+            <w:proofErr w:type="spellEnd"/>
+            <w:r>
+              <w:rPr>
+                <w:lang w:val="en-ID"/>
+              </w:rPr>
+              <w:t xml:space="preserve"> </w:t>
+            </w:r>
+            <w:proofErr w:type="spellStart"/>
+            <w:r>
+              <w:rPr>
+                <w:lang w:val="en-ID"/>
+              </w:rPr>
+              <w:t>tersusun</w:t>
+            </w:r>
+            <w:proofErr w:type="spellEnd"/>
+            <w:r>
+              <w:rPr>
+                <w:lang w:val="en-ID"/>
+              </w:rPr>
+              <w:t xml:space="preserve"> </w:t>
+            </w:r>
+            <w:proofErr w:type="spellStart"/>
+            <w:r>
+              <w:rPr>
+                <w:lang w:val="en-ID"/>
+              </w:rPr>
+              <w:t>rapi</w:t>
+            </w:r>
+            <w:proofErr w:type="spellEnd"/>
+            <w:r>
+              <w:rPr>
+                <w:lang w:val="en-ID"/>
+              </w:rPr>
+              <w:t xml:space="preserve"> di </w:t>
+            </w:r>
+            <w:proofErr w:type="spellStart"/>
+            <w:r>
+              <w:rPr>
+                <w:lang w:val="en-ID"/>
+              </w:rPr>
+              <w:t>lemari</w:t>
+            </w:r>
+            <w:proofErr w:type="spellEnd"/>
+            <w:r>
+              <w:rPr>
+                <w:lang w:val="en-ID"/>
+              </w:rPr>
+              <w:t xml:space="preserve"> </w:t>
+            </w:r>
+            <w:proofErr w:type="spellStart"/>
+            <w:r>
+              <w:rPr>
+                <w:lang w:val="en-ID"/>
+              </w:rPr>
+              <w:t>buku</w:t>
+            </w:r>
+            <w:proofErr w:type="spellEnd"/>
+            <w:r>
+              <w:rPr>
+                <w:lang w:val="en-ID"/>
+              </w:rPr>
+              <w:t>"</w:t>
+            </w:r>
           </w:p>
         </w:tc>
         <w:tc>
@@ -9847,6 +10460,11 @@
             <w:pPr>
               <w:spacing w:before="20" w:after="20" w:line="252" w:lineRule="auto"/>
             </w:pPr>
+            <w:proofErr w:type="spellStart"/>
+            <w:r>
+              <w:t>ya</w:t>
+            </w:r>
+            <w:proofErr w:type="spellEnd"/>
           </w:p>
         </w:tc>
       </w:tr>
@@ -11262,6 +11880,9 @@
             <w:pPr>
               <w:spacing w:before="20" w:after="20" w:line="252" w:lineRule="auto"/>
             </w:pPr>
+            <w:r>
+              <w:t>text</w:t>
+            </w:r>
           </w:p>
         </w:tc>
         <w:tc>
@@ -11278,6 +11899,19 @@
             <w:pPr>
               <w:spacing w:before="20" w:after="20" w:line="252" w:lineRule="auto"/>
             </w:pPr>
+            <w:proofErr w:type="spellStart"/>
+            <w:r>
+              <w:t>judul</w:t>
+            </w:r>
+            <w:proofErr w:type="spellEnd"/>
+            <w:r>
+              <w:t xml:space="preserve"> </w:t>
+            </w:r>
+            <w:proofErr w:type="spellStart"/>
+            <w:r>
+              <w:t>komik</w:t>
+            </w:r>
+            <w:proofErr w:type="spellEnd"/>
           </w:p>
         </w:tc>
         <w:tc>
@@ -11294,6 +11928,11 @@
             <w:pPr>
               <w:spacing w:before="20" w:after="20" w:line="252" w:lineRule="auto"/>
             </w:pPr>
+            <w:proofErr w:type="spellStart"/>
+            <w:r>
+              <w:t>Judul</w:t>
+            </w:r>
+            <w:proofErr w:type="spellEnd"/>
           </w:p>
         </w:tc>
         <w:tc>
@@ -11315,7 +11954,7 @@
                 <w:rFonts w:cs="Carlito"/>
                 <w:sz w:val="18"/>
               </w:rPr>
-              <w:t>required / min / max / pattern</w:t>
+              <w:t>Required</w:t>
             </w:r>
           </w:p>
         </w:tc>
@@ -11365,6 +12004,9 @@
             <w:pPr>
               <w:spacing w:before="20" w:after="20" w:line="252" w:lineRule="auto"/>
             </w:pPr>
+            <w:r>
+              <w:t>number</w:t>
+            </w:r>
           </w:p>
         </w:tc>
         <w:tc>
@@ -11382,6 +12024,14 @@
             <w:pPr>
               <w:spacing w:before="20" w:after="20" w:line="252" w:lineRule="auto"/>
             </w:pPr>
+            <w:proofErr w:type="spellStart"/>
+            <w:r>
+              <w:t>Jumlah</w:t>
+            </w:r>
+            <w:proofErr w:type="spellEnd"/>
+            <w:r>
+              <w:t xml:space="preserve"> chapter</w:t>
+            </w:r>
           </w:p>
         </w:tc>
         <w:tc>
@@ -11399,6 +12049,9 @@
             <w:pPr>
               <w:spacing w:before="20" w:after="20" w:line="252" w:lineRule="auto"/>
             </w:pPr>
+            <w:r>
+              <w:t>Chapter</w:t>
+            </w:r>
           </w:p>
         </w:tc>
         <w:tc>
@@ -11416,6 +12069,9 @@
             <w:pPr>
               <w:spacing w:before="20" w:after="20" w:line="252" w:lineRule="auto"/>
             </w:pPr>
+            <w:r>
+              <w:t>Required</w:t>
+            </w:r>
           </w:p>
         </w:tc>
       </w:tr>
@@ -11462,6 +12118,9 @@
             <w:pPr>
               <w:spacing w:before="20" w:after="20" w:line="252" w:lineRule="auto"/>
             </w:pPr>
+            <w:r>
+              <w:t>date</w:t>
+            </w:r>
           </w:p>
         </w:tc>
         <w:tc>
@@ -11478,6 +12137,14 @@
             <w:pPr>
               <w:spacing w:before="20" w:after="20" w:line="252" w:lineRule="auto"/>
             </w:pPr>
+            <w:proofErr w:type="spellStart"/>
+            <w:r>
+              <w:t>Tanggal</w:t>
+            </w:r>
+            <w:proofErr w:type="spellEnd"/>
+            <w:r>
+              <w:t xml:space="preserve"> daftar</w:t>
+            </w:r>
           </w:p>
         </w:tc>
         <w:tc>
@@ -11494,6 +12161,11 @@
             <w:pPr>
               <w:spacing w:before="20" w:after="20" w:line="252" w:lineRule="auto"/>
             </w:pPr>
+            <w:proofErr w:type="spellStart"/>
+            <w:r>
+              <w:t>tanggal</w:t>
+            </w:r>
+            <w:proofErr w:type="spellEnd"/>
           </w:p>
         </w:tc>
         <w:tc>
@@ -11510,6 +12182,9 @@
             <w:pPr>
               <w:spacing w:before="20" w:after="20" w:line="252" w:lineRule="auto"/>
             </w:pPr>
+            <w:r>
+              <w:t>Required</w:t>
+            </w:r>
           </w:p>
         </w:tc>
       </w:tr>
@@ -11682,6 +12357,54 @@
             <w:pPr>
               <w:spacing w:before="20" w:after="20" w:line="252" w:lineRule="auto"/>
             </w:pPr>
+            <w:proofErr w:type="spellStart"/>
+            <w:r>
+              <w:t>Kursor</w:t>
+            </w:r>
+            <w:proofErr w:type="spellEnd"/>
+            <w:r>
+              <w:t xml:space="preserve"> </w:t>
+            </w:r>
+            <w:proofErr w:type="spellStart"/>
+            <w:r>
+              <w:t>otomatis</w:t>
+            </w:r>
+            <w:proofErr w:type="spellEnd"/>
+            <w:r>
+              <w:t xml:space="preserve"> </w:t>
+            </w:r>
+            <w:proofErr w:type="spellStart"/>
+            <w:r>
+              <w:t>berpindah</w:t>
+            </w:r>
+            <w:proofErr w:type="spellEnd"/>
+            <w:r>
+              <w:t xml:space="preserve"> </w:t>
+            </w:r>
+            <w:proofErr w:type="spellStart"/>
+            <w:r>
+              <w:t>ke</w:t>
+            </w:r>
+            <w:proofErr w:type="spellEnd"/>
+            <w:r>
+              <w:t xml:space="preserve"> </w:t>
+            </w:r>
+            <w:proofErr w:type="spellStart"/>
+            <w:r>
+              <w:t>dalam</w:t>
+            </w:r>
+            <w:proofErr w:type="spellEnd"/>
+            <w:r>
+              <w:t xml:space="preserve"> </w:t>
+            </w:r>
+            <w:proofErr w:type="spellStart"/>
+            <w:r>
+              <w:t>kolom</w:t>
+            </w:r>
+            <w:proofErr w:type="spellEnd"/>
+            <w:r>
+              <w:t xml:space="preserve"> input</w:t>
+            </w:r>
           </w:p>
         </w:tc>
       </w:tr>
@@ -11754,6 +12477,19 @@
             <w:pPr>
               <w:spacing w:before="20" w:after="20" w:line="252" w:lineRule="auto"/>
             </w:pPr>
+            <w:proofErr w:type="spellStart"/>
+            <w:r>
+              <w:t>Terhalang</w:t>
+            </w:r>
+            <w:proofErr w:type="spellEnd"/>
+            <w:r>
+              <w:t xml:space="preserve"> oleh </w:t>
+            </w:r>
+            <w:proofErr w:type="spellStart"/>
+            <w:r>
+              <w:t>peringatan</w:t>
+            </w:r>
+            <w:proofErr w:type="spellEnd"/>
           </w:p>
         </w:tc>
       </w:tr>
@@ -11823,6 +12559,35 @@
             <w:pPr>
               <w:spacing w:before="20" w:after="20" w:line="252" w:lineRule="auto"/>
             </w:pPr>
+            <w:proofErr w:type="spellStart"/>
+            <w:r>
+              <w:t>Huruf</w:t>
+            </w:r>
+            <w:proofErr w:type="spellEnd"/>
+            <w:r>
+              <w:t xml:space="preserve"> </w:t>
+            </w:r>
+            <w:proofErr w:type="spellStart"/>
+            <w:r>
+              <w:t>tidak</w:t>
+            </w:r>
+            <w:proofErr w:type="spellEnd"/>
+            <w:r>
+              <w:t xml:space="preserve"> </w:t>
+            </w:r>
+            <w:proofErr w:type="spellStart"/>
+            <w:r>
+              <w:t>bisa</w:t>
+            </w:r>
+            <w:proofErr w:type="spellEnd"/>
+            <w:r>
+              <w:t xml:space="preserve"> </w:t>
+            </w:r>
+            <w:proofErr w:type="spellStart"/>
+            <w:r>
+              <w:t>diketik</w:t>
+            </w:r>
+            <w:proofErr w:type="spellEnd"/>
           </w:p>
         </w:tc>
       </w:tr>
@@ -11895,6 +12660,35 @@
             <w:pPr>
               <w:spacing w:before="20" w:after="20" w:line="252" w:lineRule="auto"/>
             </w:pPr>
+            <w:proofErr w:type="gramStart"/>
+            <w:r>
+              <w:t>Form</w:t>
+            </w:r>
+            <w:proofErr w:type="gramEnd"/>
+            <w:r>
+              <w:t xml:space="preserve"> </w:t>
+            </w:r>
+            <w:proofErr w:type="spellStart"/>
+            <w:r>
+              <w:t>otomatis</w:t>
+            </w:r>
+            <w:proofErr w:type="spellEnd"/>
+            <w:r>
+              <w:t xml:space="preserve"> </w:t>
+            </w:r>
+            <w:proofErr w:type="spellStart"/>
+            <w:r>
+              <w:t>memicu</w:t>
+            </w:r>
+            <w:proofErr w:type="spellEnd"/>
+            <w:r>
+              <w:t xml:space="preserve"> </w:t>
+            </w:r>
+            <w:proofErr w:type="spellStart"/>
+            <w:r>
+              <w:t>validasi</w:t>
+            </w:r>
+            <w:proofErr w:type="spellEnd"/>
           </w:p>
         </w:tc>
       </w:tr>
@@ -12476,6 +13270,12 @@
             <w:pPr>
               <w:spacing w:before="20" w:after="20" w:line="252" w:lineRule="auto"/>
             </w:pPr>
+            <w:r>
+              <w:t>20</w:t>
+            </w:r>
+            <w:r>
+              <w:t>/21</w:t>
+            </w:r>
           </w:p>
         </w:tc>
         <w:tc>
@@ -12492,6 +13292,62 @@
             <w:pPr>
               <w:spacing w:before="20" w:after="20" w:line="252" w:lineRule="auto"/>
             </w:pPr>
+            <w:r>
+              <w:t xml:space="preserve">Target </w:t>
+            </w:r>
+            <w:proofErr w:type="spellStart"/>
+            <w:r>
+              <w:t>sentuh</w:t>
+            </w:r>
+            <w:proofErr w:type="spellEnd"/>
+            <w:r>
+              <w:t xml:space="preserve"> </w:t>
+            </w:r>
+            <w:proofErr w:type="spellStart"/>
+            <w:r>
+              <w:t>tidak</w:t>
+            </w:r>
+            <w:proofErr w:type="spellEnd"/>
+            <w:r>
+              <w:t xml:space="preserve"> </w:t>
+            </w:r>
+            <w:proofErr w:type="spellStart"/>
+            <w:r>
+              <w:t>memiliki</w:t>
+            </w:r>
+            <w:proofErr w:type="spellEnd"/>
+            <w:r>
+              <w:t xml:space="preserve"> </w:t>
+            </w:r>
+            <w:proofErr w:type="spellStart"/>
+            <w:r>
+              <w:t>ukuran</w:t>
+            </w:r>
+            <w:proofErr w:type="spellEnd"/>
+            <w:r>
+              <w:t xml:space="preserve"> </w:t>
+            </w:r>
+            <w:proofErr w:type="spellStart"/>
+            <w:r>
+              <w:t>atau</w:t>
+            </w:r>
+            <w:proofErr w:type="spellEnd"/>
+            <w:r>
+              <w:t xml:space="preserve"> </w:t>
+            </w:r>
+            <w:proofErr w:type="spellStart"/>
+            <w:r>
+              <w:t>spasi</w:t>
+            </w:r>
+            <w:proofErr w:type="spellEnd"/>
+            <w:r>
+              <w:t xml:space="preserve"> yang </w:t>
+            </w:r>
+            <w:proofErr w:type="spellStart"/>
+            <w:r>
+              <w:t>memandai</w:t>
+            </w:r>
+            <w:proofErr w:type="spellEnd"/>
           </w:p>
         </w:tc>
       </w:tr>
@@ -12748,8 +13604,49 @@
                 <w:rFonts w:cs="Carlito"/>
                 <w:sz w:val="19"/>
               </w:rPr>
-              <w:t>Lancar / ada yang terlewat: ______________</w:t>
-            </w:r>
+              <w:t xml:space="preserve">Lancar / </w:t>
+            </w:r>
+            <w:proofErr w:type="spellStart"/>
+            <w:r>
+              <w:rPr>
+                <w:rFonts w:cs="Carlito"/>
+                <w:sz w:val="19"/>
+              </w:rPr>
+              <w:t>ada</w:t>
+            </w:r>
+            <w:proofErr w:type="spellEnd"/>
+            <w:r>
+              <w:rPr>
+                <w:rFonts w:cs="Carlito"/>
+                <w:sz w:val="19"/>
+              </w:rPr>
+              <w:t xml:space="preserve"> yang </w:t>
+            </w:r>
+            <w:proofErr w:type="spellStart"/>
+            <w:r>
+              <w:rPr>
+                <w:rFonts w:cs="Carlito"/>
+                <w:sz w:val="19"/>
+              </w:rPr>
+              <w:t>terlewat</w:t>
+            </w:r>
+            <w:proofErr w:type="spellEnd"/>
+            <w:r>
+              <w:rPr>
+                <w:rFonts w:cs="Carlito"/>
+                <w:sz w:val="19"/>
+              </w:rPr>
+              <w:t xml:space="preserve">: </w:t>
+            </w:r>
+            <w:proofErr w:type="spellStart"/>
+            <w:r>
+              <w:rPr>
+                <w:rFonts w:cs="Carlito"/>
+                <w:sz w:val="19"/>
+              </w:rPr>
+              <w:t>lancar</w:t>
+            </w:r>
+            <w:proofErr w:type="spellEnd"/>
           </w:p>
         </w:tc>
       </w:tr>
@@ -12827,8 +13724,33 @@
                 <w:rFonts w:cs="Carlito"/>
                 <w:sz w:val="19"/>
               </w:rPr>
-              <w:t>Semua benar / yang salah: ______________</w:t>
-            </w:r>
+              <w:t xml:space="preserve">Semua benar / yang salah: </w:t>
+            </w:r>
+            <w:proofErr w:type="spellStart"/>
+            <w:r>
+              <w:rPr>
+                <w:rFonts w:cs="Carlito"/>
+                <w:sz w:val="19"/>
+              </w:rPr>
+              <w:t>semua</w:t>
+            </w:r>
+            <w:proofErr w:type="spellEnd"/>
+            <w:r>
+              <w:rPr>
+                <w:rFonts w:cs="Carlito"/>
+                <w:sz w:val="19"/>
+              </w:rPr>
+              <w:t xml:space="preserve"> </w:t>
+            </w:r>
+            <w:proofErr w:type="spellStart"/>
+            <w:r>
+              <w:rPr>
+                <w:rFonts w:cs="Carlito"/>
+                <w:sz w:val="19"/>
+              </w:rPr>
+              <w:t>benar</w:t>
+            </w:r>
+            <w:proofErr w:type="spellEnd"/>
           </w:p>
         </w:tc>
       </w:tr>
@@ -12903,8 +13825,33 @@
                 <w:rFonts w:cs="Carlito"/>
                 <w:sz w:val="19"/>
               </w:rPr>
-              <w:t>Semua benar / yang salah: ______________</w:t>
-            </w:r>
+              <w:t xml:space="preserve">Semua benar / yang salah: </w:t>
+            </w:r>
+            <w:proofErr w:type="spellStart"/>
+            <w:r>
+              <w:rPr>
+                <w:rFonts w:cs="Carlito"/>
+                <w:sz w:val="19"/>
+              </w:rPr>
+              <w:t>semua</w:t>
+            </w:r>
+            <w:proofErr w:type="spellEnd"/>
+            <w:r>
+              <w:rPr>
+                <w:rFonts w:cs="Carlito"/>
+                <w:sz w:val="19"/>
+              </w:rPr>
+              <w:t xml:space="preserve"> </w:t>
+            </w:r>
+            <w:proofErr w:type="spellStart"/>
+            <w:r>
+              <w:rPr>
+                <w:rFonts w:cs="Carlito"/>
+                <w:sz w:val="19"/>
+              </w:rPr>
+              <w:t>benar</w:t>
+            </w:r>
+            <w:proofErr w:type="spellEnd"/>
           </w:p>
         </w:tc>
       </w:tr>
@@ -13390,7 +14337,143 @@
               <w:right w:val="single" w:sz="4" w:space="0" w:color="B9C6E2"/>
             </w:tcBorders>
           </w:tcPr>
-          <w:p/>
+          <w:p>
+            <w:r>
+              <w:t xml:space="preserve">&lt;table&gt; </w:t>
+            </w:r>
+            <w:proofErr w:type="spellStart"/>
+            <w:r>
+              <w:t>karena</w:t>
+            </w:r>
+            <w:proofErr w:type="spellEnd"/>
+            <w:r>
+              <w:t xml:space="preserve"> </w:t>
+            </w:r>
+            <w:r>
+              <w:t xml:space="preserve">Hal </w:t>
+            </w:r>
+            <w:proofErr w:type="spellStart"/>
+            <w:r>
+              <w:t>ini</w:t>
+            </w:r>
+            <w:proofErr w:type="spellEnd"/>
+            <w:r>
+              <w:t xml:space="preserve"> </w:t>
+            </w:r>
+            <w:proofErr w:type="spellStart"/>
+            <w:r>
+              <w:t>memastikan</w:t>
+            </w:r>
+            <w:proofErr w:type="spellEnd"/>
+            <w:r>
+              <w:t xml:space="preserve"> </w:t>
+            </w:r>
+            <w:proofErr w:type="spellStart"/>
+            <w:r>
+              <w:t>judul</w:t>
+            </w:r>
+            <w:proofErr w:type="spellEnd"/>
+            <w:r>
+              <w:t xml:space="preserve"> </w:t>
+            </w:r>
+            <w:proofErr w:type="spellStart"/>
+            <w:r>
+              <w:t>komik</w:t>
+            </w:r>
+            <w:proofErr w:type="spellEnd"/>
+            <w:r>
+              <w:t xml:space="preserve"> </w:t>
+            </w:r>
+            <w:proofErr w:type="spellStart"/>
+            <w:r>
+              <w:t>teridentifikasi</w:t>
+            </w:r>
+            <w:proofErr w:type="spellEnd"/>
+            <w:r>
+              <w:t xml:space="preserve"> </w:t>
+            </w:r>
+            <w:proofErr w:type="spellStart"/>
+            <w:r>
+              <w:t>secara</w:t>
+            </w:r>
+            <w:proofErr w:type="spellEnd"/>
+            <w:r>
+              <w:t xml:space="preserve"> </w:t>
+            </w:r>
+            <w:proofErr w:type="spellStart"/>
+            <w:r>
+              <w:t>eksplisit</w:t>
+            </w:r>
+            <w:proofErr w:type="spellEnd"/>
+            <w:r>
+              <w:t xml:space="preserve"> </w:t>
+            </w:r>
+            <w:proofErr w:type="spellStart"/>
+            <w:r>
+              <w:t>sebagai</w:t>
+            </w:r>
+            <w:proofErr w:type="spellEnd"/>
+            <w:r>
+              <w:t xml:space="preserve"> </w:t>
+            </w:r>
+            <w:proofErr w:type="spellStart"/>
+            <w:r>
+              <w:t>pembeda</w:t>
+            </w:r>
+            <w:proofErr w:type="spellEnd"/>
+            <w:r>
+              <w:t xml:space="preserve"> </w:t>
+            </w:r>
+            <w:proofErr w:type="spellStart"/>
+            <w:r>
+              <w:t>antarbaris</w:t>
+            </w:r>
+            <w:proofErr w:type="spellEnd"/>
+            <w:r>
+              <w:t xml:space="preserve"> data yang </w:t>
+            </w:r>
+            <w:proofErr w:type="spellStart"/>
+            <w:r>
+              <w:t>aksesibel</w:t>
+            </w:r>
+            <w:proofErr w:type="spellEnd"/>
+            <w:r>
+              <w:t xml:space="preserve"> </w:t>
+            </w:r>
+            <w:proofErr w:type="spellStart"/>
+            <w:r>
+              <w:t>bagi</w:t>
+            </w:r>
+            <w:proofErr w:type="spellEnd"/>
+            <w:r>
+              <w:t xml:space="preserve"> </w:t>
+            </w:r>
+            <w:proofErr w:type="spellStart"/>
+            <w:r>
+              <w:rPr>
+                <w:i/>
+                <w:iCs/>
+              </w:rPr>
+              <w:t>pembaca</w:t>
+            </w:r>
+            <w:proofErr w:type="spellEnd"/>
+            <w:r>
+              <w:rPr>
+                <w:i/>
+                <w:iCs/>
+              </w:rPr>
+              <w:t xml:space="preserve"> </w:t>
+            </w:r>
+            <w:proofErr w:type="spellStart"/>
+            <w:r>
+              <w:rPr>
+                <w:i/>
+                <w:iCs/>
+              </w:rPr>
+              <w:t>layar</w:t>
+            </w:r>
+            <w:proofErr w:type="spellEnd"/>
+          </w:p>
         </w:tc>
       </w:tr>
       <w:tr>
@@ -13452,7 +14535,56 @@
               <w:right w:val="single" w:sz="4" w:space="0" w:color="B9C6E2"/>
             </w:tcBorders>
           </w:tcPr>
-          <w:p/>
+          <w:p>
+            <w:r>
+              <w:t xml:space="preserve">&lt;header&gt; </w:t>
+            </w:r>
+            <w:proofErr w:type="spellStart"/>
+            <w:r>
+              <w:t>tidak</w:t>
+            </w:r>
+            <w:proofErr w:type="spellEnd"/>
+            <w:r>
+              <w:t xml:space="preserve"> </w:t>
+            </w:r>
+            <w:proofErr w:type="spellStart"/>
+            <w:r>
+              <w:t>memilik</w:t>
+            </w:r>
+            <w:proofErr w:type="spellEnd"/>
+            <w:r>
+              <w:t xml:space="preserve"> </w:t>
+            </w:r>
+            <w:proofErr w:type="spellStart"/>
+            <w:r>
+              <w:t>ukuran</w:t>
+            </w:r>
+            <w:proofErr w:type="spellEnd"/>
+            <w:r>
+              <w:t xml:space="preserve"> </w:t>
+            </w:r>
+            <w:proofErr w:type="spellStart"/>
+            <w:r>
+              <w:t>atau</w:t>
+            </w:r>
+            <w:proofErr w:type="spellEnd"/>
+            <w:r>
+              <w:t xml:space="preserve"> </w:t>
+            </w:r>
+            <w:proofErr w:type="spellStart"/>
+            <w:r>
+              <w:t>spasi</w:t>
+            </w:r>
+            <w:proofErr w:type="spellEnd"/>
+            <w:r>
+              <w:t xml:space="preserve"> yang </w:t>
+            </w:r>
+            <w:proofErr w:type="spellStart"/>
+            <w:r>
+              <w:t>memadai</w:t>
+            </w:r>
+            <w:proofErr w:type="spellEnd"/>
+          </w:p>
         </w:tc>
       </w:tr>
       <w:tr>
@@ -13514,7 +14646,21 @@
               <w:right w:val="single" w:sz="4" w:space="0" w:color="B9C6E2"/>
             </w:tcBorders>
           </w:tcPr>
-          <w:p/>
+          <w:p>
+            <w:proofErr w:type="spellStart"/>
+            <w:r>
+              <w:t>Pembaca</w:t>
+            </w:r>
+            <w:proofErr w:type="spellEnd"/>
+            <w:r>
+              <w:t xml:space="preserve"> </w:t>
+            </w:r>
+            <w:proofErr w:type="spellStart"/>
+            <w:r>
+              <w:t>layar</w:t>
+            </w:r>
+            <w:proofErr w:type="spellEnd"/>
+          </w:p>
         </w:tc>
       </w:tr>
       <w:tr>
@@ -13576,7 +14722,29 @@
               <w:right w:val="single" w:sz="4" w:space="0" w:color="B9C6E2"/>
             </w:tcBorders>
           </w:tcPr>
-          <w:p/>
+          <w:p>
+            <w:proofErr w:type="spellStart"/>
+            <w:r>
+              <w:t>Menandai</w:t>
+            </w:r>
+            <w:proofErr w:type="spellEnd"/>
+            <w:r>
+              <w:t xml:space="preserve"> </w:t>
+            </w:r>
+            <w:proofErr w:type="spellStart"/>
+            <w:r>
+              <w:t>konten</w:t>
+            </w:r>
+            <w:proofErr w:type="spellEnd"/>
+            <w:r>
+              <w:t xml:space="preserve"> </w:t>
+            </w:r>
+            <w:proofErr w:type="spellStart"/>
+            <w:r>
+              <w:t>utama</w:t>
+            </w:r>
+            <w:proofErr w:type="spellEnd"/>
+          </w:p>
         </w:tc>
       </w:tr>
       <w:tr>
@@ -13640,21 +14808,41 @@
             <w:pPr>
               <w:spacing w:after="0"/>
             </w:pPr>
-            <w:r>
-              <w:rPr>
-                <w:rFonts w:cs="Carlito"/>
+            <w:proofErr w:type="gramStart"/>
+            <w:r>
+              <w:rPr>
+                <w:rFonts w:ascii="Aptos Narrow" w:hAnsi="Aptos Narrow" w:cs="Carlito"/>
                 <w:color w:val="003796"/>
                 <w:sz w:val="22"/>
               </w:rPr>
-              <w:t xml:space="preserve">☐  </w:t>
-            </w:r>
+              <w:t>✓</w:t>
+            </w:r>
+            <w:r>
+              <w:rPr>
+                <w:rFonts w:cs="Carlito"/>
+                <w:color w:val="003796"/>
+                <w:sz w:val="22"/>
+              </w:rPr>
+              <w:t xml:space="preserve">  </w:t>
+            </w:r>
+            <w:proofErr w:type="spellStart"/>
             <w:r>
               <w:rPr>
                 <w:rFonts w:cs="Carlito"/>
                 <w:b/>
                 <w:sz w:val="20"/>
               </w:rPr>
-              <w:t xml:space="preserve">Berkas  </w:t>
+              <w:t>Berkas</w:t>
+            </w:r>
+            <w:proofErr w:type="spellEnd"/>
+            <w:proofErr w:type="gramEnd"/>
+            <w:r>
+              <w:rPr>
+                <w:rFonts w:cs="Carlito"/>
+                <w:b/>
+                <w:sz w:val="20"/>
+              </w:rPr>
+              <w:t xml:space="preserve">  </w:t>
             </w:r>
             <w:r>
               <w:rPr>
@@ -13662,7 +14850,25 @@
                 <w:color w:val="5A6080"/>
                 <w:sz w:val="19"/>
               </w:rPr>
-              <w:t>profil.html ada di repository, terbuka tanpa galat di Console</w:t>
+              <w:t xml:space="preserve">profil.html </w:t>
+            </w:r>
+            <w:proofErr w:type="spellStart"/>
+            <w:r>
+              <w:rPr>
+                <w:rFonts w:cs="Carlito"/>
+                <w:color w:val="5A6080"/>
+                <w:sz w:val="19"/>
+              </w:rPr>
+              <w:t>ada</w:t>
+            </w:r>
+            <w:proofErr w:type="spellEnd"/>
+            <w:r>
+              <w:rPr>
+                <w:rFonts w:cs="Carlito"/>
+                <w:color w:val="5A6080"/>
+                <w:sz w:val="19"/>
+              </w:rPr>
+              <w:t xml:space="preserve"> di repository, terbuka tanpa galat di Console</w:t>
             </w:r>
           </w:p>
         </w:tc>
@@ -13697,21 +14903,60 @@
             <w:pPr>
               <w:spacing w:after="0"/>
             </w:pPr>
-            <w:r>
-              <w:rPr>
-                <w:rFonts w:cs="Carlito"/>
+            <w:proofErr w:type="gramStart"/>
+            <w:r>
+              <w:rPr>
+                <w:rFonts w:ascii="Aptos Narrow" w:hAnsi="Aptos Narrow" w:cs="Carlito"/>
                 <w:color w:val="003796"/>
                 <w:sz w:val="22"/>
               </w:rPr>
-              <w:t xml:space="preserve">☐  </w:t>
-            </w:r>
+              <w:t>✓</w:t>
+            </w:r>
+            <w:r>
+              <w:rPr>
+                <w:rFonts w:cs="Carlito"/>
+                <w:color w:val="003796"/>
+                <w:sz w:val="22"/>
+              </w:rPr>
+              <w:t xml:space="preserve">  </w:t>
+            </w:r>
+            <w:proofErr w:type="spellStart"/>
             <w:r>
               <w:rPr>
                 <w:rFonts w:cs="Carlito"/>
                 <w:b/>
                 <w:sz w:val="20"/>
               </w:rPr>
-              <w:t xml:space="preserve">Kepala dokumen  </w:t>
+              <w:t>Kepala</w:t>
+            </w:r>
+            <w:proofErr w:type="spellEnd"/>
+            <w:proofErr w:type="gramEnd"/>
+            <w:r>
+              <w:rPr>
+                <w:rFonts w:cs="Carlito"/>
+                <w:b/>
+                <w:sz w:val="20"/>
+              </w:rPr>
+              <w:t xml:space="preserve"> </w:t>
+            </w:r>
+            <w:proofErr w:type="spellStart"/>
+            <w:proofErr w:type="gramStart"/>
+            <w:r>
+              <w:rPr>
+                <w:rFonts w:cs="Carlito"/>
+                <w:b/>
+                <w:sz w:val="20"/>
+              </w:rPr>
+              <w:t>dokumen</w:t>
+            </w:r>
+            <w:proofErr w:type="spellEnd"/>
+            <w:r>
+              <w:rPr>
+                <w:rFonts w:cs="Carlito"/>
+                <w:b/>
+                <w:sz w:val="20"/>
+              </w:rPr>
+              <w:t xml:space="preserve">  </w:t>
             </w:r>
             <w:r>
               <w:rPr>
@@ -13719,7 +14964,16 @@
                 <w:color w:val="5A6080"/>
                 <w:sz w:val="19"/>
               </w:rPr>
-              <w:t>lang, charset, viewport, dan title semuanya benar</w:t>
+              <w:t>lang</w:t>
+            </w:r>
+            <w:proofErr w:type="gramEnd"/>
+            <w:r>
+              <w:rPr>
+                <w:rFonts w:cs="Carlito"/>
+                <w:color w:val="5A6080"/>
+                <w:sz w:val="19"/>
+              </w:rPr>
+              <w:t>, charset, viewport, dan title semuanya benar</w:t>
             </w:r>
           </w:p>
         </w:tc>
@@ -13754,21 +15008,41 @@
             <w:pPr>
               <w:spacing w:after="0"/>
             </w:pPr>
-            <w:r>
-              <w:rPr>
-                <w:rFonts w:cs="Carlito"/>
+            <w:proofErr w:type="gramStart"/>
+            <w:r>
+              <w:rPr>
+                <w:rFonts w:ascii="Aptos Narrow" w:hAnsi="Aptos Narrow" w:cs="Carlito"/>
                 <w:color w:val="003796"/>
                 <w:sz w:val="22"/>
               </w:rPr>
-              <w:t xml:space="preserve">☐  </w:t>
-            </w:r>
+              <w:t>✓</w:t>
+            </w:r>
+            <w:r>
+              <w:rPr>
+                <w:rFonts w:cs="Carlito"/>
+                <w:color w:val="003796"/>
+                <w:sz w:val="22"/>
+              </w:rPr>
+              <w:t xml:space="preserve">  </w:t>
+            </w:r>
+            <w:proofErr w:type="spellStart"/>
             <w:r>
               <w:rPr>
                 <w:rFonts w:cs="Carlito"/>
                 <w:b/>
                 <w:sz w:val="20"/>
               </w:rPr>
-              <w:t xml:space="preserve">Struktur  </w:t>
+              <w:t>Struktur</w:t>
+            </w:r>
+            <w:proofErr w:type="spellEnd"/>
+            <w:proofErr w:type="gramEnd"/>
+            <w:r>
+              <w:rPr>
+                <w:rFonts w:cs="Carlito"/>
+                <w:b/>
+                <w:sz w:val="20"/>
+              </w:rPr>
+              <w:t xml:space="preserve">  </w:t>
             </w:r>
             <w:r>
               <w:rPr>
@@ -13811,13 +15085,22 @@
             <w:pPr>
               <w:spacing w:after="0"/>
             </w:pPr>
-            <w:r>
-              <w:rPr>
-                <w:rFonts w:cs="Carlito"/>
+            <w:proofErr w:type="gramStart"/>
+            <w:r>
+              <w:rPr>
+                <w:rFonts w:ascii="Aptos Narrow" w:hAnsi="Aptos Narrow" w:cs="Carlito"/>
                 <w:color w:val="003796"/>
                 <w:sz w:val="22"/>
               </w:rPr>
-              <w:t xml:space="preserve">☐  </w:t>
+              <w:t>✓</w:t>
+            </w:r>
+            <w:r>
+              <w:rPr>
+                <w:rFonts w:cs="Carlito"/>
+                <w:color w:val="003796"/>
+                <w:sz w:val="22"/>
+              </w:rPr>
+              <w:t xml:space="preserve">  </w:t>
             </w:r>
             <w:r>
               <w:rPr>
@@ -13825,15 +15108,52 @@
                 <w:b/>
                 <w:sz w:val="20"/>
               </w:rPr>
-              <w:t xml:space="preserve">Heading  </w:t>
-            </w:r>
+              <w:t>Heading</w:t>
+            </w:r>
+            <w:proofErr w:type="gramEnd"/>
+            <w:r>
+              <w:rPr>
+                <w:rFonts w:cs="Carlito"/>
+                <w:b/>
+                <w:sz w:val="20"/>
+              </w:rPr>
+              <w:t xml:space="preserve">  </w:t>
+            </w:r>
+            <w:proofErr w:type="spellStart"/>
             <w:r>
               <w:rPr>
                 <w:rFonts w:cs="Carlito"/>
                 <w:color w:val="5A6080"/>
                 <w:sz w:val="19"/>
               </w:rPr>
-              <w:t>satu h1, urut ke h2 tanpa lompatan</w:t>
+              <w:t>satu</w:t>
+            </w:r>
+            <w:proofErr w:type="spellEnd"/>
+            <w:r>
+              <w:rPr>
+                <w:rFonts w:cs="Carlito"/>
+                <w:color w:val="5A6080"/>
+                <w:sz w:val="19"/>
+              </w:rPr>
+              <w:t xml:space="preserve"> h1, </w:t>
+            </w:r>
+            <w:proofErr w:type="spellStart"/>
+            <w:r>
+              <w:rPr>
+                <w:rFonts w:cs="Carlito"/>
+                <w:color w:val="5A6080"/>
+                <w:sz w:val="19"/>
+              </w:rPr>
+              <w:t>urut</w:t>
+            </w:r>
+            <w:proofErr w:type="spellEnd"/>
+            <w:r>
+              <w:rPr>
+                <w:rFonts w:cs="Carlito"/>
+                <w:color w:val="5A6080"/>
+                <w:sz w:val="19"/>
+              </w:rPr>
+              <w:t xml:space="preserve"> ke h2 tanpa lompatan</w:t>
             </w:r>
           </w:p>
         </w:tc>
@@ -13868,13 +15188,22 @@
             <w:pPr>
               <w:spacing w:after="0"/>
             </w:pPr>
-            <w:r>
-              <w:rPr>
-                <w:rFonts w:cs="Carlito"/>
+            <w:proofErr w:type="gramStart"/>
+            <w:r>
+              <w:rPr>
+                <w:rFonts w:ascii="Aptos Narrow" w:hAnsi="Aptos Narrow" w:cs="Carlito"/>
                 <w:color w:val="003796"/>
                 <w:sz w:val="22"/>
               </w:rPr>
-              <w:t xml:space="preserve">☐  </w:t>
+              <w:t>✓</w:t>
+            </w:r>
+            <w:r>
+              <w:rPr>
+                <w:rFonts w:cs="Carlito"/>
+                <w:color w:val="003796"/>
+                <w:sz w:val="22"/>
+              </w:rPr>
+              <w:t xml:space="preserve">  </w:t>
             </w:r>
             <w:r>
               <w:rPr>
@@ -13882,7 +15211,16 @@
                 <w:b/>
                 <w:sz w:val="20"/>
               </w:rPr>
-              <w:t xml:space="preserve">Tabel  </w:t>
+              <w:t>Tabel</w:t>
+            </w:r>
+            <w:proofErr w:type="gramEnd"/>
+            <w:r>
+              <w:rPr>
+                <w:rFonts w:cs="Carlito"/>
+                <w:b/>
+                <w:sz w:val="20"/>
+              </w:rPr>
+              <w:t xml:space="preserve">  </w:t>
             </w:r>
             <w:r>
               <w:rPr>
@@ -13890,7 +15228,43 @@
                 <w:color w:val="5A6080"/>
                 <w:sz w:val="19"/>
               </w:rPr>
-              <w:t>caption, thead/tbody, th scope terpasang, minimal tiga baris data</w:t>
+              <w:t xml:space="preserve">caption, </w:t>
+            </w:r>
+            <w:proofErr w:type="spellStart"/>
+            <w:r>
+              <w:rPr>
+                <w:rFonts w:cs="Carlito"/>
+                <w:color w:val="5A6080"/>
+                <w:sz w:val="19"/>
+              </w:rPr>
+              <w:t>thead</w:t>
+            </w:r>
+            <w:proofErr w:type="spellEnd"/>
+            <w:r>
+              <w:rPr>
+                <w:rFonts w:cs="Carlito"/>
+                <w:color w:val="5A6080"/>
+                <w:sz w:val="19"/>
+              </w:rPr>
+              <w:t>/</w:t>
+            </w:r>
+            <w:proofErr w:type="spellStart"/>
+            <w:r>
+              <w:rPr>
+                <w:rFonts w:cs="Carlito"/>
+                <w:color w:val="5A6080"/>
+                <w:sz w:val="19"/>
+              </w:rPr>
+              <w:t>tbody</w:t>
+            </w:r>
+            <w:proofErr w:type="spellEnd"/>
+            <w:r>
+              <w:rPr>
+                <w:rFonts w:cs="Carlito"/>
+                <w:color w:val="5A6080"/>
+                <w:sz w:val="19"/>
+              </w:rPr>
+              <w:t>, th scope terpasang, minimal tiga baris data</w:t>
             </w:r>
           </w:p>
         </w:tc>
@@ -13925,13 +15299,22 @@
             <w:pPr>
               <w:spacing w:after="0"/>
             </w:pPr>
-            <w:r>
-              <w:rPr>
-                <w:rFonts w:cs="Carlito"/>
+            <w:proofErr w:type="gramStart"/>
+            <w:r>
+              <w:rPr>
+                <w:rFonts w:ascii="Aptos Narrow" w:hAnsi="Aptos Narrow" w:cs="Carlito"/>
                 <w:color w:val="003796"/>
                 <w:sz w:val="22"/>
               </w:rPr>
-              <w:t xml:space="preserve">☐  </w:t>
+              <w:t>✓</w:t>
+            </w:r>
+            <w:r>
+              <w:rPr>
+                <w:rFonts w:cs="Carlito"/>
+                <w:color w:val="003796"/>
+                <w:sz w:val="22"/>
+              </w:rPr>
+              <w:t xml:space="preserve">  </w:t>
             </w:r>
             <w:r>
               <w:rPr>
@@ -13939,15 +15322,34 @@
                 <w:b/>
                 <w:sz w:val="20"/>
               </w:rPr>
-              <w:t xml:space="preserve">Gambar  </w:t>
-            </w:r>
+              <w:t>Gambar</w:t>
+            </w:r>
+            <w:proofErr w:type="gramEnd"/>
+            <w:r>
+              <w:rPr>
+                <w:rFonts w:cs="Carlito"/>
+                <w:b/>
+                <w:sz w:val="20"/>
+              </w:rPr>
+              <w:t xml:space="preserve">  </w:t>
+            </w:r>
+            <w:proofErr w:type="spellStart"/>
             <w:r>
               <w:rPr>
                 <w:rFonts w:cs="Carlito"/>
                 <w:color w:val="5A6080"/>
                 <w:sz w:val="19"/>
               </w:rPr>
-              <w:t>ada minimal satu gambar dengan alt bermakna dan width/height</w:t>
+              <w:t>ada</w:t>
+            </w:r>
+            <w:proofErr w:type="spellEnd"/>
+            <w:r>
+              <w:rPr>
+                <w:rFonts w:cs="Carlito"/>
+                <w:color w:val="5A6080"/>
+                <w:sz w:val="19"/>
+              </w:rPr>
+              <w:t xml:space="preserve"> minimal satu gambar dengan alt bermakna dan width/height</w:t>
             </w:r>
           </w:p>
         </w:tc>
@@ -13982,13 +15384,22 @@
             <w:pPr>
               <w:spacing w:after="0"/>
             </w:pPr>
-            <w:r>
-              <w:rPr>
-                <w:rFonts w:cs="Carlito"/>
+            <w:proofErr w:type="gramStart"/>
+            <w:r>
+              <w:rPr>
+                <w:rFonts w:ascii="Aptos Narrow" w:hAnsi="Aptos Narrow" w:cs="Carlito"/>
                 <w:color w:val="003796"/>
                 <w:sz w:val="22"/>
               </w:rPr>
-              <w:t xml:space="preserve">☐  </w:t>
+              <w:t>✓</w:t>
+            </w:r>
+            <w:r>
+              <w:rPr>
+                <w:rFonts w:cs="Carlito"/>
+                <w:color w:val="003796"/>
+                <w:sz w:val="22"/>
+              </w:rPr>
+              <w:t xml:space="preserve">  </w:t>
             </w:r>
             <w:r>
               <w:rPr>
@@ -13996,15 +15407,52 @@
                 <w:b/>
                 <w:sz w:val="20"/>
               </w:rPr>
-              <w:t xml:space="preserve">Form  </w:t>
-            </w:r>
+              <w:t>Form</w:t>
+            </w:r>
+            <w:proofErr w:type="gramEnd"/>
+            <w:r>
+              <w:rPr>
+                <w:rFonts w:cs="Carlito"/>
+                <w:b/>
+                <w:sz w:val="20"/>
+              </w:rPr>
+              <w:t xml:space="preserve">  </w:t>
+            </w:r>
+            <w:proofErr w:type="spellStart"/>
             <w:r>
               <w:rPr>
                 <w:rFonts w:cs="Carlito"/>
                 <w:color w:val="5A6080"/>
                 <w:sz w:val="19"/>
               </w:rPr>
-              <w:t>tiga kolom, setiap label for cocok dengan id input-nya</w:t>
+              <w:t>tiga</w:t>
+            </w:r>
+            <w:proofErr w:type="spellEnd"/>
+            <w:r>
+              <w:rPr>
+                <w:rFonts w:cs="Carlito"/>
+                <w:color w:val="5A6080"/>
+                <w:sz w:val="19"/>
+              </w:rPr>
+              <w:t xml:space="preserve"> </w:t>
+            </w:r>
+            <w:proofErr w:type="spellStart"/>
+            <w:r>
+              <w:rPr>
+                <w:rFonts w:cs="Carlito"/>
+                <w:color w:val="5A6080"/>
+                <w:sz w:val="19"/>
+              </w:rPr>
+              <w:t>kolom</w:t>
+            </w:r>
+            <w:proofErr w:type="spellEnd"/>
+            <w:r>
+              <w:rPr>
+                <w:rFonts w:cs="Carlito"/>
+                <w:color w:val="5A6080"/>
+                <w:sz w:val="19"/>
+              </w:rPr>
+              <w:t>, setiap label for cocok dengan id input-nya</w:t>
             </w:r>
           </w:p>
         </w:tc>
@@ -14039,29 +15487,77 @@
             <w:pPr>
               <w:spacing w:after="0"/>
             </w:pPr>
-            <w:r>
-              <w:rPr>
-                <w:rFonts w:cs="Carlito"/>
+            <w:proofErr w:type="gramStart"/>
+            <w:r>
+              <w:rPr>
+                <w:rFonts w:ascii="Aptos Narrow" w:hAnsi="Aptos Narrow" w:cs="Carlito"/>
                 <w:color w:val="003796"/>
                 <w:sz w:val="22"/>
               </w:rPr>
-              <w:t xml:space="preserve">☐  </w:t>
-            </w:r>
+              <w:t>✓</w:t>
+            </w:r>
+            <w:r>
+              <w:rPr>
+                <w:rFonts w:cs="Carlito"/>
+                <w:color w:val="003796"/>
+                <w:sz w:val="22"/>
+              </w:rPr>
+              <w:t xml:space="preserve">  </w:t>
+            </w:r>
+            <w:proofErr w:type="spellStart"/>
             <w:r>
               <w:rPr>
                 <w:rFonts w:cs="Carlito"/>
                 <w:b/>
                 <w:sz w:val="20"/>
               </w:rPr>
-              <w:t xml:space="preserve">Validasi  </w:t>
-            </w:r>
+              <w:t>Validasi</w:t>
+            </w:r>
+            <w:proofErr w:type="spellEnd"/>
+            <w:proofErr w:type="gramEnd"/>
+            <w:r>
+              <w:rPr>
+                <w:rFonts w:cs="Carlito"/>
+                <w:b/>
+                <w:sz w:val="20"/>
+              </w:rPr>
+              <w:t xml:space="preserve">  </w:t>
+            </w:r>
+            <w:proofErr w:type="spellStart"/>
             <w:r>
               <w:rPr>
                 <w:rFonts w:cs="Carlito"/>
                 <w:color w:val="5A6080"/>
                 <w:sz w:val="19"/>
               </w:rPr>
-              <w:t>ada atribut validasi dan type input yang tepat</w:t>
+              <w:t>ada</w:t>
+            </w:r>
+            <w:proofErr w:type="spellEnd"/>
+            <w:r>
+              <w:rPr>
+                <w:rFonts w:cs="Carlito"/>
+                <w:color w:val="5A6080"/>
+                <w:sz w:val="19"/>
+              </w:rPr>
+              <w:t xml:space="preserve"> </w:t>
+            </w:r>
+            <w:proofErr w:type="spellStart"/>
+            <w:r>
+              <w:rPr>
+                <w:rFonts w:cs="Carlito"/>
+                <w:color w:val="5A6080"/>
+                <w:sz w:val="19"/>
+              </w:rPr>
+              <w:t>atribut</w:t>
+            </w:r>
+            <w:proofErr w:type="spellEnd"/>
+            <w:r>
+              <w:rPr>
+                <w:rFonts w:cs="Carlito"/>
+                <w:color w:val="5A6080"/>
+                <w:sz w:val="19"/>
+              </w:rPr>
+              <w:t xml:space="preserve"> validasi dan type input yang tepat</w:t>
             </w:r>
           </w:p>
         </w:tc>
@@ -14096,13 +15592,22 @@
             <w:pPr>
               <w:spacing w:after="0"/>
             </w:pPr>
-            <w:r>
-              <w:rPr>
-                <w:rFonts w:cs="Carlito"/>
+            <w:proofErr w:type="gramStart"/>
+            <w:r>
+              <w:rPr>
+                <w:rFonts w:ascii="Aptos Narrow" w:hAnsi="Aptos Narrow" w:cs="Carlito"/>
                 <w:color w:val="003796"/>
                 <w:sz w:val="22"/>
               </w:rPr>
-              <w:t xml:space="preserve">☐  </w:t>
+              <w:t>✓</w:t>
+            </w:r>
+            <w:r>
+              <w:rPr>
+                <w:rFonts w:cs="Carlito"/>
+                <w:color w:val="003796"/>
+                <w:sz w:val="22"/>
+              </w:rPr>
+              <w:t xml:space="preserve">  </w:t>
             </w:r>
             <w:r>
               <w:rPr>
@@ -14110,15 +15615,54 @@
                 <w:b/>
                 <w:sz w:val="20"/>
               </w:rPr>
-              <w:t xml:space="preserve">Papan ketik  </w:t>
-            </w:r>
+              <w:t>Papan</w:t>
+            </w:r>
+            <w:proofErr w:type="gramEnd"/>
+            <w:r>
+              <w:rPr>
+                <w:rFonts w:cs="Carlito"/>
+                <w:b/>
+                <w:sz w:val="20"/>
+              </w:rPr>
+              <w:t xml:space="preserve"> </w:t>
+            </w:r>
+            <w:proofErr w:type="spellStart"/>
+            <w:proofErr w:type="gramStart"/>
+            <w:r>
+              <w:rPr>
+                <w:rFonts w:cs="Carlito"/>
+                <w:b/>
+                <w:sz w:val="20"/>
+              </w:rPr>
+              <w:t>ketik</w:t>
+            </w:r>
+            <w:proofErr w:type="spellEnd"/>
+            <w:r>
+              <w:rPr>
+                <w:rFonts w:cs="Carlito"/>
+                <w:b/>
+                <w:sz w:val="20"/>
+              </w:rPr>
+              <w:t xml:space="preserve">  </w:t>
+            </w:r>
+            <w:proofErr w:type="spellStart"/>
             <w:r>
               <w:rPr>
                 <w:rFonts w:cs="Carlito"/>
                 <w:color w:val="5A6080"/>
                 <w:sz w:val="19"/>
               </w:rPr>
-              <w:t>seluruh halaman bisa dipakai tanpa tetikus</w:t>
+              <w:t>seluruh</w:t>
+            </w:r>
+            <w:proofErr w:type="spellEnd"/>
+            <w:proofErr w:type="gramEnd"/>
+            <w:r>
+              <w:rPr>
+                <w:rFonts w:cs="Carlito"/>
+                <w:color w:val="5A6080"/>
+                <w:sz w:val="19"/>
+              </w:rPr>
+              <w:t xml:space="preserve"> halaman bisa dipakai tanpa tetikus</w:t>
             </w:r>
           </w:p>
         </w:tc>
@@ -14153,13 +15697,22 @@
             <w:pPr>
               <w:spacing w:after="0"/>
             </w:pPr>
-            <w:r>
-              <w:rPr>
-                <w:rFonts w:cs="Carlito"/>
+            <w:proofErr w:type="gramStart"/>
+            <w:r>
+              <w:rPr>
+                <w:rFonts w:ascii="Aptos Narrow" w:hAnsi="Aptos Narrow" w:cs="Carlito"/>
                 <w:color w:val="003796"/>
                 <w:sz w:val="22"/>
               </w:rPr>
-              <w:t xml:space="preserve">☐  </w:t>
+              <w:t>✓</w:t>
+            </w:r>
+            <w:r>
+              <w:rPr>
+                <w:rFonts w:cs="Carlito"/>
+                <w:color w:val="003796"/>
+                <w:sz w:val="22"/>
+              </w:rPr>
+              <w:t xml:space="preserve">  </w:t>
             </w:r>
             <w:r>
               <w:rPr>
@@ -14167,15 +15720,34 @@
                 <w:b/>
                 <w:sz w:val="20"/>
               </w:rPr>
-              <w:t xml:space="preserve">Lighthouse  </w:t>
-            </w:r>
+              <w:t>Lighthouse</w:t>
+            </w:r>
+            <w:proofErr w:type="gramEnd"/>
+            <w:r>
+              <w:rPr>
+                <w:rFonts w:cs="Carlito"/>
+                <w:b/>
+                <w:sz w:val="20"/>
+              </w:rPr>
+              <w:t xml:space="preserve">  </w:t>
+            </w:r>
+            <w:proofErr w:type="spellStart"/>
             <w:r>
               <w:rPr>
                 <w:rFonts w:cs="Carlito"/>
                 <w:color w:val="5A6080"/>
                 <w:sz w:val="19"/>
               </w:rPr>
-              <w:t>skor Accessibility sudah dicatat apa adanya</w:t>
+              <w:t>skor</w:t>
+            </w:r>
+            <w:proofErr w:type="spellEnd"/>
+            <w:r>
+              <w:rPr>
+                <w:rFonts w:cs="Carlito"/>
+                <w:color w:val="5A6080"/>
+                <w:sz w:val="19"/>
+              </w:rPr>
+              <w:t xml:space="preserve"> Accessibility sudah dicatat apa adanya</w:t>
             </w:r>
           </w:p>
         </w:tc>
@@ -14210,21 +15782,50 @@
             <w:pPr>
               <w:spacing w:after="0"/>
             </w:pPr>
-            <w:r>
-              <w:rPr>
-                <w:rFonts w:cs="Carlito"/>
+            <w:proofErr w:type="gramStart"/>
+            <w:r>
+              <w:rPr>
+                <w:rFonts w:ascii="Aptos Narrow" w:hAnsi="Aptos Narrow" w:cs="Carlito"/>
                 <w:color w:val="003796"/>
                 <w:sz w:val="22"/>
               </w:rPr>
-              <w:t xml:space="preserve">☐  </w:t>
-            </w:r>
+              <w:t>✓</w:t>
+            </w:r>
+            <w:r>
+              <w:rPr>
+                <w:rFonts w:cs="Carlito"/>
+                <w:color w:val="003796"/>
+                <w:sz w:val="22"/>
+              </w:rPr>
+              <w:t xml:space="preserve">  </w:t>
+            </w:r>
+            <w:proofErr w:type="spellStart"/>
             <w:r>
               <w:rPr>
                 <w:rFonts w:cs="Carlito"/>
                 <w:b/>
                 <w:sz w:val="20"/>
               </w:rPr>
-              <w:t xml:space="preserve">Pengungkapan AI  </w:t>
+              <w:t>Pengungkapan</w:t>
+            </w:r>
+            <w:proofErr w:type="spellEnd"/>
+            <w:proofErr w:type="gramEnd"/>
+            <w:r>
+              <w:rPr>
+                <w:rFonts w:cs="Carlito"/>
+                <w:b/>
+                <w:sz w:val="20"/>
+              </w:rPr>
+              <w:t xml:space="preserve"> </w:t>
+            </w:r>
+            <w:proofErr w:type="gramStart"/>
+            <w:r>
+              <w:rPr>
+                <w:rFonts w:cs="Carlito"/>
+                <w:b/>
+                <w:sz w:val="20"/>
+              </w:rPr>
+              <w:t xml:space="preserve">AI  </w:t>
             </w:r>
             <w:r>
               <w:rPr>
@@ -14232,7 +15833,16 @@
                 <w:color w:val="5A6080"/>
                 <w:sz w:val="19"/>
               </w:rPr>
-              <w:t>README menyebutkan bagian mana yang dibantu AI</w:t>
+              <w:t>README</w:t>
+            </w:r>
+            <w:proofErr w:type="gramEnd"/>
+            <w:r>
+              <w:rPr>
+                <w:rFonts w:cs="Carlito"/>
+                <w:color w:val="5A6080"/>
+                <w:sz w:val="19"/>
+              </w:rPr>
+              <w:t xml:space="preserve"> menyebutkan bagian mana yang dibantu AI</w:t>
             </w:r>
           </w:p>
         </w:tc>
@@ -14267,29 +15877,77 @@
             <w:pPr>
               <w:spacing w:after="0"/>
             </w:pPr>
-            <w:r>
-              <w:rPr>
-                <w:rFonts w:cs="Carlito"/>
+            <w:proofErr w:type="gramStart"/>
+            <w:r>
+              <w:rPr>
+                <w:rFonts w:ascii="Aptos Narrow" w:hAnsi="Aptos Narrow" w:cs="Carlito"/>
                 <w:color w:val="003796"/>
                 <w:sz w:val="22"/>
               </w:rPr>
-              <w:t xml:space="preserve">☐  </w:t>
-            </w:r>
+              <w:t>✓</w:t>
+            </w:r>
+            <w:r>
+              <w:rPr>
+                <w:rFonts w:cs="Carlito"/>
+                <w:color w:val="003796"/>
+                <w:sz w:val="22"/>
+              </w:rPr>
+              <w:t xml:space="preserve">  </w:t>
+            </w:r>
+            <w:proofErr w:type="spellStart"/>
             <w:r>
               <w:rPr>
                 <w:rFonts w:cs="Carlito"/>
                 <w:b/>
                 <w:sz w:val="20"/>
               </w:rPr>
-              <w:t xml:space="preserve">Keaslian  </w:t>
-            </w:r>
+              <w:t>Keaslian</w:t>
+            </w:r>
+            <w:proofErr w:type="spellEnd"/>
+            <w:proofErr w:type="gramEnd"/>
+            <w:r>
+              <w:rPr>
+                <w:rFonts w:cs="Carlito"/>
+                <w:b/>
+                <w:sz w:val="20"/>
+              </w:rPr>
+              <w:t xml:space="preserve">  </w:t>
+            </w:r>
+            <w:proofErr w:type="spellStart"/>
             <w:r>
               <w:rPr>
                 <w:rFonts w:cs="Carlito"/>
                 <w:color w:val="5A6080"/>
                 <w:sz w:val="19"/>
               </w:rPr>
-              <w:t>topik dan isi halaman ini milik saya sendiri, tidak menyalin teman</w:t>
+              <w:t>topik</w:t>
+            </w:r>
+            <w:proofErr w:type="spellEnd"/>
+            <w:r>
+              <w:rPr>
+                <w:rFonts w:cs="Carlito"/>
+                <w:color w:val="5A6080"/>
+                <w:sz w:val="19"/>
+              </w:rPr>
+              <w:t xml:space="preserve"> dan </w:t>
+            </w:r>
+            <w:proofErr w:type="spellStart"/>
+            <w:r>
+              <w:rPr>
+                <w:rFonts w:cs="Carlito"/>
+                <w:color w:val="5A6080"/>
+                <w:sz w:val="19"/>
+              </w:rPr>
+              <w:t>isi</w:t>
+            </w:r>
+            <w:proofErr w:type="spellEnd"/>
+            <w:r>
+              <w:rPr>
+                <w:rFonts w:cs="Carlito"/>
+                <w:color w:val="5A6080"/>
+                <w:sz w:val="19"/>
+              </w:rPr>
+              <w:t xml:space="preserve"> halaman ini milik saya sendiri, tidak menyalin teman</w:t>
             </w:r>
           </w:p>
         </w:tc>
@@ -14413,6 +16071,9 @@
             <w:pPr>
               <w:spacing w:before="20" w:after="20" w:line="252" w:lineRule="auto"/>
             </w:pPr>
+            <w:r>
+              <w:t>25</w:t>
+            </w:r>
           </w:p>
         </w:tc>
       </w:tr>
@@ -14461,6 +16122,9 @@
             <w:pPr>
               <w:spacing w:before="20" w:after="20" w:line="252" w:lineRule="auto"/>
             </w:pPr>
+            <w:r>
+              <w:t>20</w:t>
+            </w:r>
           </w:p>
         </w:tc>
       </w:tr>
@@ -14507,6 +16171,9 @@
             <w:pPr>
               <w:spacing w:before="20" w:after="20" w:line="252" w:lineRule="auto"/>
             </w:pPr>
+            <w:r>
+              <w:t>20</w:t>
+            </w:r>
           </w:p>
         </w:tc>
       </w:tr>
@@ -14555,6 +16222,9 @@
             <w:pPr>
               <w:spacing w:before="20" w:after="20" w:line="252" w:lineRule="auto"/>
             </w:pPr>
+            <w:r>
+              <w:t>25</w:t>
+            </w:r>
           </w:p>
         </w:tc>
       </w:tr>
@@ -14601,6 +16271,9 @@
             <w:pPr>
               <w:spacing w:before="20" w:after="20" w:line="252" w:lineRule="auto"/>
             </w:pPr>
+            <w:r>
+              <w:t>10</w:t>
+            </w:r>
           </w:p>
         </w:tc>
       </w:tr>
@@ -14649,6 +16322,9 @@
             <w:pPr>
               <w:spacing w:before="20" w:after="20" w:line="252" w:lineRule="auto"/>
             </w:pPr>
+            <w:r>
+              <w:t>100</w:t>
+            </w:r>
           </w:p>
         </w:tc>
       </w:tr>
@@ -20492,7 +22168,6 @@
   <w:style w:type="character" w:default="1" w:styleId="DefaultParagraphFont">
     <w:name w:val="Default Paragraph Font"/>
     <w:uiPriority w:val="1"/>
-    <w:semiHidden/>
     <w:unhideWhenUsed/>
   </w:style>
   <w:style w:type="table" w:default="1" w:styleId="TableNormal">
@@ -31269,6 +32944,29 @@
       </w:tcPr>
     </w:tblStylePr>
   </w:style>
+  <w:style w:type="character" w:styleId="Hyperlink">
+    <w:name w:val="Hyperlink"/>
+    <w:basedOn w:val="DefaultParagraphFont"/>
+    <w:uiPriority w:val="99"/>
+    <w:unhideWhenUsed/>
+    <w:rsid w:val="00C80F77"/>
+    <w:rPr>
+      <w:color w:val="0000FF" w:themeColor="hyperlink"/>
+      <w:u w:val="single"/>
+    </w:rPr>
+  </w:style>
+  <w:style w:type="character" w:styleId="UnresolvedMention">
+    <w:name w:val="Unresolved Mention"/>
+    <w:basedOn w:val="DefaultParagraphFont"/>
+    <w:uiPriority w:val="99"/>
+    <w:semiHidden/>
+    <w:unhideWhenUsed/>
+    <w:rsid w:val="00C80F77"/>
+    <w:rPr>
+      <w:color w:val="605E5C"/>
+      <w:shd w:val="clear" w:color="auto" w:fill="E1DFDD"/>
+    </w:rPr>
+  </w:style>
 </w:styles>
 </file>
 

</xml_diff>